<commit_message>
Apply author's wording edits (31 Oct) with grammar/meaning fixes; keep CSME template, 6 pages
Co-Authored-By: Claude Opus 5.5 <noreply@anthropic.com>
Claude-Session: https://claude.ai/code/session_019mQSSZrr74cbeDdr3V2xBg
</commit_message>
<xml_diff>
--- a/ncue-pv-inverter-uncertainty/paper_rev/CSME2026_Govino_A10-006.docx
+++ b/ncue-pv-inverter-uncertainty/paper_rev/CSME2026_Govino_A10-006.docx
@@ -231,7 +231,7 @@
           <w:sz w:val="20"/>
           <w:szCs w:val="20"/>
         </w:rPr>
-        <w:t xml:space="preserve">Rooftop PV energy is often estimated from datasheets and public weather data. We model a 139.5 kWp plant in Taiwan (372 modules; one 30 kW and two 50 kW inverters) with pvlib, rank nine uncertain factors with a converged Sobol analysis (45,056 runs), and compare the model with the AC power recorded at the common inverter output and with the lifetime energy counters of the inverters. DC loss and irradiation error explain 84% of the annual variance and the inverter model 7%; this inverter effect comes from the assumed efficiency (2.6%) and hardly from the model structure (0.4–0.6%). On clear autumn and winter days the plant delivered 80–89% of the modeled energy (nMBE up to +24%), although the hourly profile is reproduced (r ≥ 0.97); the budget reaches this only when all factors are at their lowest ends together. Over 3.5 years, however, the inverter counters agree with the model within 3%. The model is thus suitable for annual energy but biased on clear days at hourly scale, and separating the causes requires irradiance measured on site.</w:t>
+        <w:t xml:space="preserve">Rooftop photovoltaic (PV) energy output is frequently estimated using datasheets and publicly available weather data. In this study, a 139.5 kWp PV plant in Taiwan (comprising 372 modules, one 30 kW inverter and two 50 kW inverters) is modeled using pvlib. Nine uncertain factors are ranked through a converged Sobol analysis (45,056 runs), and the model is compared with AC power measurements at the common inverter output as well as with the lifetime energy counters of the inverters. DC loss and irradiation error account for 84% of the annual variance, while the inverter model contributes 7%. The inverter effect is primarily due to the assumed efficiency (2.6%) rather than the model structure (0.4–0.6%). On clear autumn and winter days, the plant delivered 80–89% of the modeled energy (normalized mean bias error up to +24%), although the hourly profile is accurately reproduced (correlation coefficient r ≥ 0.97). The uncertainty budget only matches the observations when all of the factors are at their minimum. Over a 3.5-year period, the inverter counters agree with the model to within 3%. The model is therefore suitable for annual energy estimates but biased at the hourly level on clear days, and on-site irradiance measurements are needed to identify the root causes.</w:t>
       </w:r>
     </w:p>
     <w:p>
@@ -1045,7 +1045,7 @@
           <w:sz w:val="20"/>
           <w:szCs w:val="20"/>
         </w:rPr>
-        <w:t xml:space="preserve">with rms values. With three wires and no neutral, the instantaneous power follows from two products (two-wattmeter method), which also holds under unbalance and distortion [28]:</w:t>
+        <w:t xml:space="preserve">With three wires and no neutral, the instantaneous power is obtained from two products (two-wattmeter method), which also applies under unbalance and distortion [28]:</w:t>
       </w:r>
     </w:p>
     <w:p>
@@ -1217,7 +1217,7 @@
       <w:r>
         <w:drawing>
           <wp:inline xmlns:a="http://schemas.openxmlformats.org/drawingml/2006/main" xmlns:pic="http://schemas.openxmlformats.org/drawingml/2006/picture">
-            <wp:extent cx="2468880" cy="1608513"/>
+            <wp:extent cx="2377440" cy="1548938"/>
             <wp:docPr id="2" name="Picture 2"/>
             <wp:cNvGraphicFramePr>
               <a:graphicFrameLocks noChangeAspect="1"/>
@@ -1238,7 +1238,7 @@
                   <pic:spPr>
                     <a:xfrm>
                       <a:off x="0" y="0"/>
-                      <a:ext cx="2468880" cy="1608513"/>
+                      <a:ext cx="2377440" cy="1548938"/>
                     </a:xfrm>
                     <a:prstGeom prst="rect"/>
                   </pic:spPr>
@@ -1357,7 +1357,7 @@
           <w:sz w:val="20"/>
           <w:szCs w:val="20"/>
         </w:rPr>
-        <w:t xml:space="preserve">, a line-to-line voltage is √3 times the phase voltage and leads it by 30°; multiplying each current by its own line-to-line voltage would therefore overstate the power by 3 cos 30°/√3 = 1.5. The records show voltages 120° ± 1.5° apart, currents lagging by 0.5–4.3°, unbalance below 3.8% and a power factor of 0.995, and Eq. (1) applied to the fundamentals agrees with Eq. (2) within 0.13% (median).</w:t>
+        <w:t xml:space="preserve">, a line-to-line voltage is √3 times the phase voltage and 30° ahead of it. Multiplying each current by its corresponding line-to-line voltage would therefore give 3 cos 30°/√3 = 1.5 times the true power. The voltages are 120° ± 1.5° apart, the currents lag by 0.5° to 4.3°, the unbalance is less than 3.8% and the power factor is 0.995. Eq. (1) applied to the fundamentals agrees with Eq. (2) to within 0.13% (median).</w:t>
       </w:r>
     </w:p>
     <w:p>
@@ -1372,7 +1372,7 @@
           <w:sz w:val="20"/>
           <w:szCs w:val="20"/>
         </w:rPr>
-        <w:t xml:space="preserve">The main record (16–19 October 2026) was sampled at 2 ms, thinned to 10 ms and averaged to 4,201 one-minute values (no gap longer than 90 s); seven two-hour records (2025–2026) were thinned to 20 ms. Thinning without a filter aliases the 60 Hz waveforms, but at 10 and 20 ms the samples fall on five equally spaced points of the cycle, so the power ripple averages out over a minute; intervals of whole cycles, such as 200 ms, sample a single point and were avoided. A test with 400 synthetic minutes carrying the measured unbalance, harmonics and ±30% power changes confirms this: the error of the one-minute power is at most 0.06% (10 ms) and 0.05% (20 ms), 0.12% with the grid frequency at exactly 60 Hz, against up to 12% for 200 ms.</w:t>
+        <w:t xml:space="preserve">The main dataset (collected 16 to 19 October 2026) was sampled at 2 ms, thinned to 10 ms and averaged to give 4,201 one-minute values; no data gap was longer than 90 s. Seven further two-hour datasets (from 2025 to 2026) were thinned to 20 ms. Thinning without filtering introduces aliasing of the 60 Hz waveforms; however, at 10 ms and 20 ms the samples are distributed across five equally spaced points in the cycle, allowing the power ripple to average out over one minute. Sampling intervals corresponding to whole cycles, such as 200 ms, were avoided because they sample a single point in the cycle. An evaluation using 400 synthetic minutes (incorporating the measured unbalance, harmonics and ±30% power variation) confirmed this: the maximum error of the one-minute power was 0.06% for 10 ms and 0.05% for 20 ms intervals, and 0.12% when the grid frequency was exactly 60 Hz, whereas errors reached 12% for 200 ms intervals.</w:t>
       </w:r>
     </w:p>
     <w:p>
@@ -1420,7 +1420,7 @@
           <w:sz w:val="20"/>
           <w:szCs w:val="20"/>
         </w:rPr>
-        <w:t xml:space="preserve">Fig. 3 shows the chain: Erbs decomposition [19], Perez transposition [20] (albedo 0.25), Ross cell temperature [21] and PVWatts DC power [3],</w:t>
+        <w:t xml:space="preserve">Fig. 3 illustrates the sequence comprising Erbs decomposition [19], Perez transposition [20] with an albedo of 0.25, Ross cell temperature [21] and PVWatts DC power [3]:</w:t>
       </w:r>
     </w:p>
     <w:p>
@@ -1594,7 +1594,7 @@
           <w:sz w:val="20"/>
           <w:szCs w:val="20"/>
         </w:rPr>
-        <w:t xml:space="preserve">with </w:t>
+        <w:t xml:space="preserve">Here, </w:t>
       </w:r>
       <w:r>
         <w:rPr>
@@ -1621,7 +1621,7 @@
           <w:sz w:val="20"/>
           <w:szCs w:val="20"/>
         </w:rPr>
-        <w:t xml:space="preserve"> = 8.7% (11.4% with the default shading loss). Each inverter is modeled with constant efficiency, PVWatts-DS (datasheet peak η as nominal, an upper bound) or PVWatts-G (η 0.96, the pvlib default); our code equals pvlib.inverter.pvwatts to 0 W. A variant adds the Martin–Ruiz incidence-angle loss [22]; the performance ratio follows IEC 61724-1 [23].</w:t>
+        <w:t xml:space="preserve"> is set to 8.7% (or 11.4% when the default shading loss is applied). Each inverter is modeled in three ways: constant efficiency, PVWatts-DS (datasheet peak η as nominal, representing an upper bound) or PVWatts-G (η 0.96, the pvlib default); our implementation matches pvlib.inverter.pvwatts to within 0 W. A model variant incorporates the Martin–Ruiz incidence-angle loss [22], and the performance ratio is determined according to IEC 61724-1 [23].</w:t>
       </w:r>
     </w:p>
     <w:p>
@@ -1633,7 +1633,7 @@
       <w:r>
         <w:drawing>
           <wp:inline xmlns:a="http://schemas.openxmlformats.org/drawingml/2006/main" xmlns:pic="http://schemas.openxmlformats.org/drawingml/2006/picture">
-            <wp:extent cx="2606040" cy="1539055"/>
+            <wp:extent cx="2560320" cy="1512054"/>
             <wp:docPr id="3" name="Picture 3"/>
             <wp:cNvGraphicFramePr>
               <a:graphicFrameLocks noChangeAspect="1"/>
@@ -1654,7 +1654,7 @@
                   <pic:spPr>
                     <a:xfrm>
                       <a:off x="0" y="0"/>
-                      <a:ext cx="2606040" cy="1539055"/>
+                      <a:ext cx="2560320" cy="1512054"/>
                     </a:xfrm>
                     <a:prstGeom prst="rect"/>
                   </pic:spPr>
@@ -3301,7 +3301,7 @@
           <w:sz w:val="20"/>
           <w:szCs w:val="20"/>
         </w:rPr>
-        <w:t xml:space="preserve">The baseline gives 195 MWh AC (1399 kWh/kWp), and the 5th–95th percentile spans −5.5% to +11.4%. DC loss (−3.0% to +9.6%) and GHI error (±5%) explain 84% of the variance, and the inverter model ranks third (Fig. 4; 3% with ±10% GHI error). The total indices change by at most 0.004 between 1,024 and 4,096 base samples, their standard deviation over six scrambling seeds is at most 0.002, and the ranking is stable from 64 samples; the intervals of the first five factors do not overlap. Interactions are negligible (Σ</w:t>
+        <w:t xml:space="preserve">The baseline gives 195 MWh AC (1399 kWh/kWp), with the 5th to 95th percentile ranging from −5.5% to +11.4%. DC loss (−3.0% to +9.6%) and GHI error (±5%) account for 84% of the variance, and the inverter model ranks third (Fig. 4; 3% with ±10% GHI error). The total indices vary by no more than 0.004 between 1,024 and 4,096 base samples, and their standard deviation across six scrambling seeds is less than 0.002. The ranking is stable from 64 samples, and the intervals for the first five factors do not overlap. Interactions are negligible (Σ</w:t>
       </w:r>
       <w:r>
         <w:rPr>
@@ -3355,7 +3355,7 @@
           <w:sz w:val="20"/>
           <w:szCs w:val="20"/>
         </w:rPr>
-        <w:t xml:space="preserve"> = 0.005), the layout mapping changes the energy by less than 0.01%, and no inverter clips at the baseline loss (without DC loss at most 21 kWh per year).</w:t>
+        <w:t xml:space="preserve"> = 0.005), the layout mapping changes the energy by less than 0.01%, and no inverter clips at the baseline loss; without DC loss, clipping is limited to a maximum of 21 kWh per year.</w:t>
       </w:r>
     </w:p>
     <w:p>
@@ -3367,7 +3367,7 @@
       <w:r>
         <w:drawing>
           <wp:inline xmlns:a="http://schemas.openxmlformats.org/drawingml/2006/main" xmlns:pic="http://schemas.openxmlformats.org/drawingml/2006/picture">
-            <wp:extent cx="2606040" cy="1816331"/>
+            <wp:extent cx="2560320" cy="1784465"/>
             <wp:docPr id="4" name="Picture 4"/>
             <wp:cNvGraphicFramePr>
               <a:graphicFrameLocks noChangeAspect="1"/>
@@ -3388,7 +3388,7 @@
                   <pic:spPr>
                     <a:xfrm>
                       <a:off x="0" y="0"/>
-                      <a:ext cx="2606040" cy="1816331"/>
+                      <a:ext cx="2560320" cy="1784465"/>
                     </a:xfrm>
                     <a:prstGeom prst="rect"/>
                   </pic:spPr>
@@ -3482,7 +3482,7 @@
       <w:r>
         <w:drawing>
           <wp:inline xmlns:a="http://schemas.openxmlformats.org/drawingml/2006/main" xmlns:pic="http://schemas.openxmlformats.org/drawingml/2006/picture">
-            <wp:extent cx="2377440" cy="1296785"/>
+            <wp:extent cx="2286000" cy="1246909"/>
             <wp:docPr id="5" name="Picture 5"/>
             <wp:cNvGraphicFramePr>
               <a:graphicFrameLocks noChangeAspect="1"/>
@@ -3503,7 +3503,7 @@
                   <pic:spPr>
                     <a:xfrm>
                       <a:off x="0" y="0"/>
-                      <a:ext cx="2377440" cy="1296785"/>
+                      <a:ext cx="2286000" cy="1246909"/>
                     </a:xfrm>
                     <a:prstGeom prst="rect"/>
                   </pic:spPr>
@@ -3570,7 +3570,7 @@
       <w:r>
         <w:drawing>
           <wp:inline xmlns:a="http://schemas.openxmlformats.org/drawingml/2006/main" xmlns:pic="http://schemas.openxmlformats.org/drawingml/2006/picture">
-            <wp:extent cx="2606040" cy="1456316"/>
+            <wp:extent cx="2514600" cy="1405218"/>
             <wp:docPr id="6" name="Picture 6"/>
             <wp:cNvGraphicFramePr>
               <a:graphicFrameLocks noChangeAspect="1"/>
@@ -3591,7 +3591,7 @@
                   <pic:spPr>
                     <a:xfrm>
                       <a:off x="0" y="0"/>
-                      <a:ext cx="2606040" cy="1456316"/>
+                      <a:ext cx="2514600" cy="1405218"/>
                     </a:xfrm>
                     <a:prstGeom prst="rect"/>
                   </pic:spPr>
@@ -3664,7 +3664,7 @@
           <w:sz w:val="20"/>
           <w:szCs w:val="20"/>
         </w:rPr>
-        <w:t xml:space="preserve">On 17 and 18 October, with 97% and 94% of clear-sky irradiation at the station, the plant produced 585 and 557 kWh (4.20 and 3.99 kWh/kWp), with a peak of 100.5 kW against the 130 kW rating (Fig. 7). The one-minute power still shows dips (variability 0.06 and 0.13 of the mean between 10:00 and 14:00, against 0.003 on a clear February day) that AC data alone cannot attribute.</w:t>
+        <w:t xml:space="preserve">On 17 and 18 October, with 97% and 94% of clear-sky irradiation at the station, respectively, the plant produced 585 and 557 kWh (4.20 and 3.99 kWh/kWp), with a peak of 100.5 kW against the 130 kW rating (Fig. 7). The one-minute power still shows some dips (variability 0.06 and 0.13 of the mean between 10:00 and 14:00, against 0.003 on a clear February day), which the AC data alone cannot explain.</w:t>
       </w:r>
     </w:p>
     <w:p>
@@ -3676,7 +3676,7 @@
       <w:r>
         <w:drawing>
           <wp:inline xmlns:a="http://schemas.openxmlformats.org/drawingml/2006/main" xmlns:pic="http://schemas.openxmlformats.org/drawingml/2006/picture">
-            <wp:extent cx="2194560" cy="1795549"/>
+            <wp:extent cx="2103120" cy="1720735"/>
             <wp:docPr id="7" name="Picture 7"/>
             <wp:cNvGraphicFramePr>
               <a:graphicFrameLocks noChangeAspect="1"/>
@@ -3697,7 +3697,7 @@
                   <pic:spPr>
                     <a:xfrm>
                       <a:off x="0" y="0"/>
-                      <a:ext cx="2194560" cy="1795549"/>
+                      <a:ext cx="2103120" cy="1720735"/>
                     </a:xfrm>
                     <a:prstGeom prst="rect"/>
                   </pic:spPr>
@@ -3913,7 +3913,7 @@
       <w:r>
         <w:drawing>
           <wp:inline xmlns:a="http://schemas.openxmlformats.org/drawingml/2006/main" xmlns:pic="http://schemas.openxmlformats.org/drawingml/2006/picture">
-            <wp:extent cx="2331720" cy="2225733"/>
+            <wp:extent cx="2240280" cy="2138449"/>
             <wp:docPr id="8" name="Picture 8"/>
             <wp:cNvGraphicFramePr>
               <a:graphicFrameLocks noChangeAspect="1"/>
@@ -3934,7 +3934,7 @@
                   <pic:spPr>
                     <a:xfrm>
                       <a:off x="0" y="0"/>
-                      <a:ext cx="2331720" cy="2225733"/>
+                      <a:ext cx="2240280" cy="2138449"/>
                     </a:xfrm>
                     <a:prstGeom prst="rect"/>
                   </pic:spPr>
@@ -5741,7 +5741,7 @@
       <w:r>
         <w:drawing>
           <wp:inline xmlns:a="http://schemas.openxmlformats.org/drawingml/2006/main" xmlns:pic="http://schemas.openxmlformats.org/drawingml/2006/picture">
-            <wp:extent cx="2194560" cy="1396538"/>
+            <wp:extent cx="2103120" cy="1338349"/>
             <wp:docPr id="9" name="Picture 9"/>
             <wp:cNvGraphicFramePr>
               <a:graphicFrameLocks noChangeAspect="1"/>
@@ -5762,7 +5762,7 @@
                   <pic:spPr>
                     <a:xfrm>
                       <a:off x="0" y="0"/>
-                      <a:ext cx="2194560" cy="1396538"/>
+                      <a:ext cx="2103120" cy="1338349"/>
                     </a:xfrm>
                     <a:prstGeom prst="rect"/>
                   </pic:spPr>
@@ -5817,7 +5817,7 @@
           <w:sz w:val="20"/>
           <w:szCs w:val="20"/>
         </w:rPr>
-        <w:t xml:space="preserve">Across the nine days with station data, </w:t>
+        <w:t xml:space="preserve">Over the nine days with station data, </w:t>
       </w:r>
       <w:r>
         <w:rPr>
@@ -5835,7 +5835,7 @@
           <w:sz w:val="20"/>
           <w:szCs w:val="20"/>
         </w:rPr>
-        <w:t xml:space="preserve"> lies between 0.65 and 1.01 (Fig. 10). Only the five days above 0.9 of clear-sky irradiation are used for the bias, because a station 21 km away does not follow the clouds over the roof; with so few records a seasonal pattern cannot be separated from day-to-day differences. A single correction factor does not transfer either: the factor fitted on 17 October (0.812) leaves biases of +0.9% on 18 October and −0.5% on 21 December, but −8.6% on 10 February and −19.7% on 7 August, so </w:t>
+        <w:t xml:space="preserve"> ranges from 0.65 to 1.01 (Fig. 10). Only the five days above 0.9 of clear-sky irradiation are used for the bias, as a station 21 km away does not track the cloud movement over the roof; with so few records, no seasonal pattern can be separated from day-to-day differences. A single correction factor does not work either: the factor derived on 17 October (0.812) leaves a bias of +0.9% on 18 October and −0.5% on 21 December, but −8.6% on 10 February and −19.7% on 7 August. </w:t>
       </w:r>
       <w:r>
         <w:rPr>
@@ -5853,7 +5853,7 @@
           <w:sz w:val="20"/>
           <w:szCs w:val="20"/>
         </w:rPr>
-        <w:t xml:space="preserve"> must not be used as an annual correction.</w:t>
+        <w:t xml:space="preserve"> therefore cannot be used as an annual correction.</w:t>
       </w:r>
     </w:p>
     <w:p>
@@ -5865,7 +5865,7 @@
       <w:r>
         <w:drawing>
           <wp:inline xmlns:a="http://schemas.openxmlformats.org/drawingml/2006/main" xmlns:pic="http://schemas.openxmlformats.org/drawingml/2006/picture">
-            <wp:extent cx="2148840" cy="1953491"/>
+            <wp:extent cx="2057400" cy="1870364"/>
             <wp:docPr id="10" name="Picture 10"/>
             <wp:cNvGraphicFramePr>
               <a:graphicFrameLocks noChangeAspect="1"/>
@@ -5886,7 +5886,7 @@
                   <pic:spPr>
                     <a:xfrm>
                       <a:off x="0" y="0"/>
-                      <a:ext cx="2148840" cy="1953491"/>
+                      <a:ext cx="2057400" cy="1870364"/>
                     </a:xfrm>
                     <a:prstGeom prst="rect"/>
                   </pic:spPr>
@@ -5959,7 +5959,7 @@
           <w:sz w:val="20"/>
           <w:szCs w:val="20"/>
         </w:rPr>
-        <w:t xml:space="preserve">Fig. 11 stacks the lowest end of every factor. With isotropic transposition (−3.9% alone) and Boland decomposition (−1.0%), which the earlier stack omitted, together with PVWatts-G, a DC loss of 11.4%, NOCT 48 °C and the incidence-angle loss, the model falls to 87.0%, and an irradiation 5% lower brings it to 82.0%, close to the measured 81% (</w:t>
+        <w:t xml:space="preserve">Fig. 11 stacks the lowest end of every factor. With isotropic transposition (−3.9% alone) and Boland decomposition (−1.0%), which the earlier stack had omitted, plus PVWatts-G, a DC loss of 11.4%, NOCT 48 °C and the incidence-angle loss, the model comes down to 87.0%; with an irradiation 5% lower it reaches 82.0%, very close to the measured 81% (</w:t>
       </w:r>
       <w:r>
         <w:rPr>
@@ -5989,7 +5989,7 @@
       <w:r>
         <w:drawing>
           <wp:inline xmlns:a="http://schemas.openxmlformats.org/drawingml/2006/main" xmlns:pic="http://schemas.openxmlformats.org/drawingml/2006/picture">
-            <wp:extent cx="2377440" cy="1738725"/>
+            <wp:extent cx="2286000" cy="1671851"/>
             <wp:docPr id="11" name="Picture 11"/>
             <wp:cNvGraphicFramePr>
               <a:graphicFrameLocks noChangeAspect="1"/>
@@ -6010,7 +6010,7 @@
                   <pic:spPr>
                     <a:xfrm>
                       <a:off x="0" y="0"/>
-                      <a:ext cx="2377440" cy="1738725"/>
+                      <a:ext cx="2286000" cy="1671851"/>
                     </a:xfrm>
                     <a:prstGeom prst="rect"/>
                   </pic:spPr>
@@ -6077,7 +6077,7 @@
       <w:r>
         <w:drawing>
           <wp:inline xmlns:a="http://schemas.openxmlformats.org/drawingml/2006/main" xmlns:pic="http://schemas.openxmlformats.org/drawingml/2006/picture">
-            <wp:extent cx="2377440" cy="1404050"/>
+            <wp:extent cx="2286000" cy="1350048"/>
             <wp:docPr id="12" name="Picture 12"/>
             <wp:cNvGraphicFramePr>
               <a:graphicFrameLocks noChangeAspect="1"/>
@@ -6098,7 +6098,7 @@
                   <pic:spPr>
                     <a:xfrm>
                       <a:off x="0" y="0"/>
-                      <a:ext cx="2377440" cy="1404050"/>
+                      <a:ext cx="2286000" cy="1350048"/>
                     </a:xfrm>
                     <a:prstGeom prst="rect"/>
                   </pic:spPr>
@@ -6153,7 +6153,7 @@
           <w:sz w:val="20"/>
           <w:szCs w:val="20"/>
         </w:rPr>
-        <w:t xml:space="preserve">The data narrow the cause but do not settle it. A large bias of the station irradiation on cloud-free days is unlikely, and a fixed one-sided shadow is not supported. Candidates on the plant side are shading by the tower and frame, soiling before the rainy season, string mismatch, the 21-module string on the 30 kW inverter, de-rating of the middle inverter and short outages; on the measurement side, the uncalibrated recorder. Separating them requires plane-of-array irradiance, inverter-level AC logging and string currents. The inverter formulations move the energy by at most 2.6%, about a seventh of the gap, and give the same correlation, so AC data alone cannot tell which is better.</w:t>
+        <w:t xml:space="preserve">The data narrow down the cause but do not provide a definitive answer. A large bias in the station irradiation on cloud-free days is unlikely, and a fixed one-sided shadow is not supported. On the plant side, shading from the tower and frame, soiling before the rainy season, string mismatch (the 21-module string on the 30 kW inverter), de-rating of the middle inverter and short outages are all possible; on the measurement side, the uncalibrated recorder is a candidate. Separating them requires plane-of-array irradiance, inverter-level AC logging and string currents. The inverter formulations move the energy by at most 2.6% (roughly one-seventh of the gap) and give the same correlation, so the AC data alone cannot tell which is better.</w:t>
       </w:r>
     </w:p>
     <w:p>
@@ -6219,7 +6219,7 @@
           <w:sz w:val="20"/>
           <w:szCs w:val="20"/>
         </w:rPr>
-        <w:t xml:space="preserve">The datasheet model gives 195 MWh (1399 kWh/kWp) per year. DC loss and irradiation error dominate the converged Sobol budget, and the inverter effect (−2.6% to +0.4%) is an efficiency assumption rather than a structural one. The weather source matters at monthly scale (−12% to +19%). On clear days the plant produced 80–89% of the modeled energy, reached by the budget only at its joint extreme, while over 3.5 years the inverter counters agree within 3%. Roof-level irradiance is the next step before the inverter model is refined further.</w:t>
+        <w:t xml:space="preserve">The datasheet model gives 195 MWh (1399 kWh/kWp) per year. DC loss and irradiation error are the dominant contributors to the converged Sobol budget. The inverter effect (−2.6% to +0.4%) is an efficiency effect, not a structural one. The weather source is important at the monthly level (−12% to +19%). On clear days the plant delivered 80–89% of the modeled energy, which the budget reaches only at its joint extreme. Over the 3.5-year period the inverter counters agree with the model to within 3%. Roof-level irradiance is the next step before the inverter model is refined further.</w:t>
       </w:r>
     </w:p>
     <w:p>

</xml_diff>